<commit_message>
Update AI infrastructure resume and cover letter for the move to the Computing Technology Research Institute
Co-Authored-By: Claude Opus 5.5 <noreply@anthropic.com>
Claude-Session: https://claude.ai/code/session_014b3Ueq5gn52GSK2xeWEbYh
</commit_message>
<xml_diff>
--- a/cv/Qirui_-_cover-letter_2026-10-25_AI-Infra.docx
+++ b/cv/Qirui_-_cover-letter_2026-10-25_AI-Infra.docx
@@ -99,7 +99,7 @@
           <w:sz w:val="22"/>
           <w:szCs w:val="22"/>
         </w:rPr>
-        <w:t xml:space="preserve">I am writing to apply for the AI Infrastructure Lead (AI Inference Platform) role in Singapore. I am Head of Huawei’s Central Research Institute (2012 Labs) in Singapore, and over 15 years my work has moved up the stack an inference platform is built on: data-center networks and cloud infrastructure, then the systems that train and serve large models, and now the memory and caching layers that decide what serving costs.</w:t>
+        <w:t xml:space="preserve">I am writing to apply for the AI Infrastructure Lead (AI Inference Platform) role in Singapore. I head the Singapore region of the Computing Technology Research Institute in Huawei 2012 Labs, the frontier technology research arm for Huawei’s Computing Product Line, after eight years heading Huawei’s Central Research Institute in Singapore. Over 15 years my work has moved up the stack an inference platform is built on: data-center networks and cloud infrastructure, then the systems that train and serve large models, and now the memory and caching layers that decide what serving costs.</w:t>
       </w:r>
     </w:p>
     <w:p>
@@ -113,7 +113,7 @@
           <w:sz w:val="22"/>
           <w:szCs w:val="22"/>
         </w:rPr>
-        <w:t xml:space="preserve">On the serving side, I led development of the training and inference engine for Huawei’s Pangu models, which runs 10x faster than Microsoft DeepSpeed, and I direct research on large GPU clusters for LLM and multimodal training and inference, from parallelism and mixed precision to long-context serving. In vLLM, I built a unified KV and recurrent-state prefix cache for hybrid LLMs whose restored outputs are bitwise-identical to recomputation. I now lead an agent memory systems program that covers shared memory across agents, KV and state caching, and moving knowledge between text, KV cache and LoRA across GPU, DRAM, SSD and HDD tiers. These are the trade-offs a token factory lives with every day: what to keep in GPU memory, what to offload, and when it is cheaper to recompute.</w:t>
+        <w:t xml:space="preserve">On the serving side, I led development of the training and inference engine for Huawei’s Pangu models, which runs 10x faster than Microsoft DeepSpeed, and directed research on large GPU clusters for LLM and multimodal training and inference, from parallelism and mixed precision to long-context serving. In vLLM, I built a unified KV and recurrent-state prefix cache for hybrid LLMs whose restored outputs are bitwise-identical to recomputation. I now lead an agent memory systems program that covers shared memory across agents, KV and state caching, and moving knowledge between text, KV cache and LoRA across GPU, DRAM, SSD and HDD tiers. These are the trade-offs a token factory lives with every day: what to keep in GPU memory, what to offload, and when it is cheaper to recompute.</w:t>
       </w:r>
     </w:p>
     <w:p>
@@ -141,7 +141,7 @@
           <w:sz w:val="22"/>
           <w:szCs w:val="22"/>
         </w:rPr>
-        <w:t xml:space="preserve">I have also built teams from zero. I founded and built Huawei’s Singapore lab from the ground up (the Singapore region has 40 staff), later handing it over to a Chief Expert, and I now lead a five-person core team. I lead Singapore’s R&amp;D within a globally distributed institute with teams in the UK, Canada, Switzerland and Japan, and I hire and mentor researchers. Earlier, at SUTD, I led a 20-person team on the CISDeM project and delivered a MINDEF-sponsored research programme worth SGD 4.7M.</w:t>
+        <w:t xml:space="preserve">I have also built teams from zero. I founded and built Huawei’s Singapore lab from the ground up (the Singapore region has 40 staff), later handing it over to a Chief Expert, and I continue to lead a five-person core team. At the Central Research Institute I led Singapore’s R&amp;D within a globally distributed institute with teams in the UK, Canada, Switzerland and Japan, and hired and mentored researchers. Earlier, at SUTD, I led a 20-person team on the CISDeM project and delivered a MINDEF-sponsored research programme worth SGD 4.7M.</w:t>
       </w:r>
     </w:p>
     <w:p>

</xml_diff>

<commit_message>
Keep the first AI infrastructure resume and cover letter; save the updated ones as v2
Co-Authored-By: Claude Opus 5.5 <noreply@anthropic.com>
Claude-Session: https://claude.ai/code/session_014b3Ueq5gn52GSK2xeWEbYh
</commit_message>
<xml_diff>
--- a/cv/Qirui_-_cover-letter_2026-10-25_AI-Infra.docx
+++ b/cv/Qirui_-_cover-letter_2026-10-25_AI-Infra.docx
@@ -99,7 +99,7 @@
           <w:sz w:val="22"/>
           <w:szCs w:val="22"/>
         </w:rPr>
-        <w:t xml:space="preserve">I am writing to apply for the AI Infrastructure Lead (AI Inference Platform) role in Singapore. I head the Singapore region of the Computing Technology Research Institute in Huawei 2012 Labs, the frontier technology research arm for Huawei’s Computing Product Line, after eight years heading Huawei’s Central Research Institute in Singapore. Over 15 years my work has moved up the stack an inference platform is built on: data-center networks and cloud infrastructure, then the systems that train and serve large models, and now the memory and caching layers that decide what serving costs.</w:t>
+        <w:t xml:space="preserve">I am writing to apply for the AI Infrastructure Lead (AI Inference Platform) role in Singapore. I am Head of Huawei’s Central Research Institute (2012 Labs) in Singapore, and over 15 years my work has moved up the stack an inference platform is built on: data-center networks and cloud infrastructure, then the systems that train and serve large models, and now the memory and caching layers that decide what serving costs.</w:t>
       </w:r>
     </w:p>
     <w:p>
@@ -113,7 +113,7 @@
           <w:sz w:val="22"/>
           <w:szCs w:val="22"/>
         </w:rPr>
-        <w:t xml:space="preserve">On the serving side, I led development of the training and inference engine for Huawei’s Pangu models, which runs 10x faster than Microsoft DeepSpeed, and directed research on large GPU clusters for LLM and multimodal training and inference, from parallelism and mixed precision to long-context serving. In vLLM, I built a unified KV and recurrent-state prefix cache for hybrid LLMs whose restored outputs are bitwise-identical to recomputation. I now lead an agent memory systems program that covers shared memory across agents, KV and state caching, and moving knowledge between text, KV cache and LoRA across GPU, DRAM, SSD and HDD tiers. These are the trade-offs a token factory lives with every day: what to keep in GPU memory, what to offload, and when it is cheaper to recompute.</w:t>
+        <w:t xml:space="preserve">On the serving side, I led development of the training and inference engine for Huawei’s Pangu models, which runs 10x faster than Microsoft DeepSpeed, and I direct research on large GPU clusters for LLM and multimodal training and inference, from parallelism and mixed precision to long-context serving. In vLLM, I built a unified KV and recurrent-state prefix cache for hybrid LLMs whose restored outputs are bitwise-identical to recomputation. I now lead an agent memory systems program that covers shared memory across agents, KV and state caching, and moving knowledge between text, KV cache and LoRA across GPU, DRAM, SSD and HDD tiers. These are the trade-offs a token factory lives with every day: what to keep in GPU memory, what to offload, and when it is cheaper to recompute.</w:t>
       </w:r>
     </w:p>
     <w:p>
@@ -141,7 +141,7 @@
           <w:sz w:val="22"/>
           <w:szCs w:val="22"/>
         </w:rPr>
-        <w:t xml:space="preserve">I have also built teams from zero. I founded and built Huawei’s Singapore lab from the ground up (the Singapore region has 40 staff), later handing it over to a Chief Expert, and I continue to lead a five-person core team. At the Central Research Institute I led Singapore’s R&amp;D within a globally distributed institute with teams in the UK, Canada, Switzerland and Japan, and hired and mentored researchers. Earlier, at SUTD, I led a 20-person team on the CISDeM project and delivered a MINDEF-sponsored research programme worth SGD 4.7M.</w:t>
+        <w:t xml:space="preserve">I have also built teams from zero. I founded and built Huawei’s Singapore lab from the ground up (the Singapore region has 40 staff), later handing it over to a Chief Expert, and I now lead a five-person core team. I lead Singapore’s R&amp;D within a globally distributed institute with teams in the UK, Canada, Switzerland and Japan, and I hire and mentor researchers. Earlier, at SUTD, I led a 20-person team on the CISDeM project and delivered a MINDEF-sponsored research programme worth SGD 4.7M.</w:t>
       </w:r>
     </w:p>
     <w:p>

</xml_diff>